<commit_message>
Listes des tâches Mattéo (Phase 2/3)
</commit_message>
<xml_diff>
--- a/RAPPORT PROJET INFO4.docx
+++ b/RAPPORT PROJET INFO4.docx
@@ -412,19 +412,7 @@
         <w:ind w:firstLine="708"/>
       </w:pPr>
       <w:r>
-        <w:t>Pour bien organiser notre travail, nous nous sommes réparti le</w:t>
-      </w:r>
-      <w:r>
-        <w:t xml:space="preserve"> travail de cette manière</w:t>
-      </w:r>
-      <w:r>
-        <w:t xml:space="preserve"> pour cette </w:t>
-      </w:r>
-      <w:r>
-        <w:t>deuxième</w:t>
-      </w:r>
-      <w:r>
-        <w:t xml:space="preserve"> phase du projet :</w:t>
+        <w:t>Pour bien organiser notre travail, nous nous sommes réparti le travail de cette manière pour cette deuxième phase du projet :</w:t>
       </w:r>
     </w:p>
     <w:p>
@@ -496,13 +484,7 @@
         </w:numPr>
       </w:pPr>
       <w:r>
-        <w:t>Maxence :</w:t>
-      </w:r>
-      <w:r>
-        <w:t xml:space="preserve"> </w:t>
-      </w:r>
-      <w:r>
-        <w:t>(à modifier, j’ai laisser pour les fleches)</w:t>
+        <w:t>Maxence : (à modifier, j’ai laisser pour les fleches)</w:t>
       </w:r>
     </w:p>
     <w:p>
@@ -539,10 +521,10 @@
         </w:numPr>
       </w:pPr>
       <w:r>
-        <w:t>Mattéo </w:t>
-      </w:r>
-      <w:r>
-        <w:t>(à modifier, j’ai laisser pour les fleches)</w:t>
+        <w:t>Mattéo</w:t>
+      </w:r>
+      <w:r>
+        <w:t> :</w:t>
       </w:r>
     </w:p>
     <w:p>
@@ -566,7 +548,7 @@
         </w:numPr>
       </w:pPr>
       <w:r>
-        <w:t>Page des menus</w:t>
+        <w:t>Page des menus (Menus avec prix total, plats avec filtres pour le tri, etc…)</w:t>
       </w:r>
     </w:p>
     <w:p>
@@ -578,7 +560,31 @@
         </w:numPr>
       </w:pPr>
       <w:r>
-        <w:t>Page des commandes</w:t>
+        <w:t>Gestion du paiement (coordonnées bancaires, utilisation de CY-Bank, retour du paiement, etc…)</w:t>
+      </w:r>
+    </w:p>
+    <w:p>
+      <w:pPr>
+        <w:pStyle w:val="Paragraphedeliste"/>
+        <w:numPr>
+          <w:ilvl w:val="0"/>
+          <w:numId w:val="5"/>
+        </w:numPr>
+      </w:pPr>
+      <w:r>
+        <w:t>Tableau de bord du restaurateur (Listes des commandes, statuts des commandes, etc…)</w:t>
+      </w:r>
+    </w:p>
+    <w:p>
+      <w:pPr>
+        <w:pStyle w:val="Paragraphedeliste"/>
+        <w:numPr>
+          <w:ilvl w:val="0"/>
+          <w:numId w:val="5"/>
+        </w:numPr>
+      </w:pPr>
+      <w:r>
+        <w:t>Page du panier (affichage et fonctionnel pour le paiement)</w:t>
       </w:r>
     </w:p>
     <w:p/>
@@ -602,172 +608,146 @@
           <w:szCs w:val="36"/>
           <w:u w:val="single"/>
         </w:rPr>
-        <w:t>Phase n°</w:t>
-      </w:r>
-      <w:r>
-        <w:rPr>
-          <w:b/>
-          <w:bCs/>
-          <w:i/>
-          <w:iCs/>
-          <w:sz w:val="36"/>
-          <w:szCs w:val="36"/>
-          <w:u w:val="single"/>
-        </w:rPr>
-        <w:t>3</w:t>
-      </w:r>
-      <w:r>
-        <w:rPr>
-          <w:b/>
-          <w:bCs/>
-          <w:i/>
-          <w:iCs/>
-          <w:sz w:val="36"/>
-          <w:szCs w:val="36"/>
-          <w:u w:val="single"/>
-        </w:rPr>
+        <w:t>Phase n°3 :</w:t>
+      </w:r>
+    </w:p>
+    <w:p/>
+    <w:p>
+      <w:pPr>
+        <w:ind w:firstLine="708"/>
+      </w:pPr>
+      <w:r>
+        <w:t>Pour bien organiser notre travail, nous nous sommes réparti le travail de cette manière pour cette troisième phase du projet :</w:t>
+      </w:r>
+    </w:p>
+    <w:p>
+      <w:pPr>
+        <w:pStyle w:val="Paragraphedeliste"/>
+        <w:numPr>
+          <w:ilvl w:val="0"/>
+          <w:numId w:val="2"/>
+        </w:numPr>
+      </w:pPr>
+      <w:r>
+        <w:t>Maxime :</w:t>
+      </w:r>
+    </w:p>
+    <w:p>
+      <w:pPr>
+        <w:pStyle w:val="Paragraphedeliste"/>
+        <w:numPr>
+          <w:ilvl w:val="0"/>
+          <w:numId w:val="3"/>
+        </w:numPr>
+      </w:pPr>
+      <w:r>
+        <w:t>Toutes les fonctionnalités liées aux formulaires (vérification de champs, masquer/afficher le mot de passe, compteur de caractère etc…)</w:t>
+      </w:r>
+    </w:p>
+    <w:p>
+      <w:pPr>
+        <w:pStyle w:val="Paragraphedeliste"/>
+        <w:numPr>
+          <w:ilvl w:val="0"/>
+          <w:numId w:val="3"/>
+        </w:numPr>
+      </w:pPr>
+      <w:r>
+        <w:lastRenderedPageBreak/>
+        <w:t>Changement de charte graphique sur toutes les pages du sites fonctionnel avec les cookies</w:t>
+      </w:r>
+    </w:p>
+    <w:p>
+      <w:pPr>
+        <w:pStyle w:val="Paragraphedeliste"/>
+        <w:numPr>
+          <w:ilvl w:val="0"/>
+          <w:numId w:val="3"/>
+        </w:numPr>
+      </w:pPr>
+      <w:r>
+        <w:t xml:space="preserve">Page administrateur avec </w:t>
+      </w:r>
+      <w:r>
+        <w:t xml:space="preserve">blocage/déblocage des utilisateurs </w:t>
+      </w:r>
+    </w:p>
+    <w:p>
+      <w:pPr>
+        <w:pStyle w:val="Paragraphedeliste"/>
+        <w:numPr>
+          <w:ilvl w:val="0"/>
+          <w:numId w:val="3"/>
+        </w:numPr>
+      </w:pPr>
+      <w:r>
+        <w:t>Page notation fonctionnelle</w:t>
+      </w:r>
+    </w:p>
+    <w:p>
+      <w:pPr>
+        <w:pStyle w:val="Paragraphedeliste"/>
+        <w:ind w:left="1440"/>
+      </w:pPr>
+    </w:p>
+    <w:p>
+      <w:pPr>
+        <w:pStyle w:val="Paragraphedeliste"/>
+        <w:ind w:left="1440"/>
+      </w:pPr>
+    </w:p>
+    <w:p>
+      <w:pPr>
+        <w:pStyle w:val="Paragraphedeliste"/>
+        <w:numPr>
+          <w:ilvl w:val="0"/>
+          <w:numId w:val="2"/>
+        </w:numPr>
+      </w:pPr>
+      <w:r>
+        <w:t>Maxence : (à modifier, j’ai laisser pour les fleches)</w:t>
+      </w:r>
+    </w:p>
+    <w:p>
+      <w:pPr>
+        <w:pStyle w:val="Paragraphedeliste"/>
+        <w:numPr>
+          <w:ilvl w:val="0"/>
+          <w:numId w:val="4"/>
+        </w:numPr>
+      </w:pPr>
+      <w:r>
+        <w:t>Page de livraisons</w:t>
+      </w:r>
+    </w:p>
+    <w:p>
+      <w:pPr>
+        <w:pStyle w:val="Paragraphedeliste"/>
+        <w:numPr>
+          <w:ilvl w:val="0"/>
+          <w:numId w:val="4"/>
+        </w:numPr>
+      </w:pPr>
+      <w:r>
+        <w:t xml:space="preserve">Page du profil </w:t>
+      </w:r>
+    </w:p>
+    <w:p/>
+    <w:p>
+      <w:pPr>
+        <w:pStyle w:val="Paragraphedeliste"/>
+        <w:numPr>
+          <w:ilvl w:val="0"/>
+          <w:numId w:val="2"/>
+        </w:numPr>
+      </w:pPr>
+      <w:r>
+        <w:t>Mattéo</w:t>
+      </w:r>
+      <w:r>
         <w:t> :</w:t>
       </w:r>
     </w:p>
-    <w:p/>
-    <w:p>
-      <w:pPr>
-        <w:ind w:firstLine="708"/>
-      </w:pPr>
-      <w:r>
-        <w:t xml:space="preserve">Pour bien organiser notre travail, nous nous sommes réparti le travail de cette manière pour cette </w:t>
-      </w:r>
-      <w:r>
-        <w:t>troisième</w:t>
-      </w:r>
-      <w:r>
-        <w:t xml:space="preserve"> phase du projet :</w:t>
-      </w:r>
-    </w:p>
-    <w:p>
-      <w:pPr>
-        <w:pStyle w:val="Paragraphedeliste"/>
-        <w:numPr>
-          <w:ilvl w:val="0"/>
-          <w:numId w:val="2"/>
-        </w:numPr>
-      </w:pPr>
-      <w:r>
-        <w:t>Maxime :</w:t>
-      </w:r>
-    </w:p>
-    <w:p>
-      <w:pPr>
-        <w:pStyle w:val="Paragraphedeliste"/>
-        <w:numPr>
-          <w:ilvl w:val="0"/>
-          <w:numId w:val="3"/>
-        </w:numPr>
-      </w:pPr>
-      <w:r>
-        <w:t>Toutes les fonctionnalités liées aux formulaires (vérification de champs, masquer/afficher le mot de passe, compteur de caractère etc…)</w:t>
-      </w:r>
-    </w:p>
-    <w:p>
-      <w:pPr>
-        <w:pStyle w:val="Paragraphedeliste"/>
-        <w:numPr>
-          <w:ilvl w:val="0"/>
-          <w:numId w:val="3"/>
-        </w:numPr>
-      </w:pPr>
-      <w:r>
-        <w:t>Changement de charte graphique sur toutes les pages du sites fonctionnel avec les cookies</w:t>
-      </w:r>
-    </w:p>
-    <w:p>
-      <w:pPr>
-        <w:pStyle w:val="Paragraphedeliste"/>
-        <w:numPr>
-          <w:ilvl w:val="0"/>
-          <w:numId w:val="3"/>
-        </w:numPr>
-      </w:pPr>
-      <w:r>
-        <w:t xml:space="preserve">Page administrateur avec </w:t>
-      </w:r>
-      <w:r>
-        <w:t xml:space="preserve">blocage/déblocage des utilisateurs </w:t>
-      </w:r>
-    </w:p>
-    <w:p>
-      <w:pPr>
-        <w:pStyle w:val="Paragraphedeliste"/>
-        <w:numPr>
-          <w:ilvl w:val="0"/>
-          <w:numId w:val="3"/>
-        </w:numPr>
-      </w:pPr>
-      <w:r>
-        <w:t>Page notation fonctionnelle</w:t>
-      </w:r>
-    </w:p>
-    <w:p>
-      <w:pPr>
-        <w:pStyle w:val="Paragraphedeliste"/>
-        <w:ind w:left="1440"/>
-      </w:pPr>
-    </w:p>
-    <w:p>
-      <w:pPr>
-        <w:pStyle w:val="Paragraphedeliste"/>
-        <w:ind w:left="1440"/>
-      </w:pPr>
-    </w:p>
-    <w:p>
-      <w:pPr>
-        <w:pStyle w:val="Paragraphedeliste"/>
-        <w:numPr>
-          <w:ilvl w:val="0"/>
-          <w:numId w:val="2"/>
-        </w:numPr>
-      </w:pPr>
-      <w:r>
-        <w:t>Maxence : (à modifier, j’ai laisser pour les fleches)</w:t>
-      </w:r>
-    </w:p>
-    <w:p>
-      <w:pPr>
-        <w:pStyle w:val="Paragraphedeliste"/>
-        <w:numPr>
-          <w:ilvl w:val="0"/>
-          <w:numId w:val="4"/>
-        </w:numPr>
-      </w:pPr>
-      <w:r>
-        <w:t>Page de livraisons</w:t>
-      </w:r>
-    </w:p>
-    <w:p>
-      <w:pPr>
-        <w:pStyle w:val="Paragraphedeliste"/>
-        <w:numPr>
-          <w:ilvl w:val="0"/>
-          <w:numId w:val="4"/>
-        </w:numPr>
-      </w:pPr>
-      <w:r>
-        <w:t xml:space="preserve">Page du profil </w:t>
-      </w:r>
-    </w:p>
-    <w:p/>
-    <w:p>
-      <w:pPr>
-        <w:pStyle w:val="Paragraphedeliste"/>
-        <w:numPr>
-          <w:ilvl w:val="0"/>
-          <w:numId w:val="2"/>
-        </w:numPr>
-      </w:pPr>
-      <w:r>
-        <w:t>Mattéo (à modifier, j’ai laisser pour les fleches)</w:t>
-      </w:r>
-    </w:p>
     <w:p>
       <w:pPr>
         <w:pStyle w:val="Paragraphedeliste"/>
@@ -789,7 +769,7 @@
         </w:numPr>
       </w:pPr>
       <w:r>
-        <w:t>Page des menus</w:t>
+        <w:t>Page des menus (changer différentes infos avec des connexions asynchrones comme les allergènes / plat « coup de cœur », etc…)</w:t>
       </w:r>
     </w:p>
     <w:p>
@@ -801,7 +781,31 @@
         </w:numPr>
       </w:pPr>
       <w:r>
-        <w:t>Page des commandes</w:t>
+        <w:t>Page des commandes (Changement de statut fonctionnel)</w:t>
+      </w:r>
+    </w:p>
+    <w:p>
+      <w:pPr>
+        <w:pStyle w:val="Paragraphedeliste"/>
+        <w:numPr>
+          <w:ilvl w:val="0"/>
+          <w:numId w:val="5"/>
+        </w:numPr>
+      </w:pPr>
+      <w:r>
+        <w:t>Mode modification (pour une commande déjà payé)</w:t>
+      </w:r>
+    </w:p>
+    <w:p>
+      <w:pPr>
+        <w:pStyle w:val="Paragraphedeliste"/>
+        <w:numPr>
+          <w:ilvl w:val="0"/>
+          <w:numId w:val="5"/>
+        </w:numPr>
+      </w:pPr>
+      <w:r>
+        <w:t>Page du panier (Supprimer des articles + appliquer coupons de réduction)</w:t>
       </w:r>
     </w:p>
     <w:p/>

</xml_diff>

<commit_message>
Point de Fidélités fonctionnels
</commit_message>
<xml_diff>
--- a/RAPPORT PROJET INFO4.docx
+++ b/RAPPORT PROJET INFO4.docx
@@ -652,11 +652,7 @@
       </w:pPr>
       <w:r>
         <w:rPr/>
-        <w:t xml:space="preserve">Page de livraisons </w:t>
-      </w:r>
-      <w:r>
-        <w:rPr/>
-        <w:t>fonctionnelle (en attente, en cours et terminé)</w:t>
+        <w:t>Page de livraisons fonctionnelle (en attente, en cours et terminé)</w:t>
       </w:r>
     </w:p>
     <w:p>
@@ -670,11 +666,7 @@
       </w:pPr>
       <w:r>
         <w:rPr/>
-        <w:t xml:space="preserve">Page du profil </w:t>
-      </w:r>
-      <w:r>
-        <w:rPr/>
-        <w:t>avec l’affichage des informations personnelles</w:t>
+        <w:t>Page du profil avec l’affichage des informations personnelles</w:t>
       </w:r>
     </w:p>
     <w:p>
@@ -702,15 +694,7 @@
       </w:pPr>
       <w:r>
         <w:rPr/>
-        <w:t>Ajouts généraux (arborescence propre, corrections de bugs entre no</w:t>
-      </w:r>
-      <w:r>
-        <w:rPr/>
-        <w:t>s fichiers</w:t>
-      </w:r>
-      <w:r>
-        <w:rPr/>
-        <w:t>)</w:t>
+        <w:t>Ajouts généraux (arborescence propre, corrections de bugs entre nos fichiers)</w:t>
       </w:r>
     </w:p>
     <w:p>
@@ -986,11 +970,15 @@
       </w:pPr>
       <w:r>
         <w:rPr/>
-        <w:t xml:space="preserve">Page du profil </w:t>
-      </w:r>
-      <w:r>
-        <w:rPr/>
-        <w:t>(modification asynchrone de chaque champ [nom, mail, téléphone etc.] + upload d’avatar)</w:t>
+        <w:t xml:space="preserve">Page du profil (modification asynchrone de chaque champ [nom, mail, téléphone etc.] + upload d’avatar </w:t>
+      </w:r>
+      <w:r>
+        <w:rPr/>
+        <w:t>+ points de fidélité fonctionnels</w:t>
+      </w:r>
+      <w:r>
+        <w:rPr/>
+        <w:t>)</w:t>
       </w:r>
     </w:p>
     <w:p>
@@ -1004,11 +992,7 @@
       </w:pPr>
       <w:r>
         <w:rPr/>
-        <w:t xml:space="preserve">Page des livraisons en attente  </w:t>
-      </w:r>
-      <w:r>
-        <w:rPr/>
-        <w:t>(générateur de commandes aléatoires en asynchrone)</w:t>
+        <w:t>Page des livraisons en attente  (générateur de commandes aléatoires en asynchrone)</w:t>
       </w:r>
     </w:p>
     <w:p>

</xml_diff>